<commit_message>
feat: adiciona a graduação
</commit_message>
<xml_diff>
--- a/public/upload/Curriculo-Gustavo-Luiz-da-Silva-Procopio.docx
+++ b/public/upload/Curriculo-Gustavo-Luiz-da-Silva-Procopio.docx
@@ -746,7 +746,7 @@
           </mc:Choice>
           <mc:Fallback>
             <w:pict>
-              <v:shape w14:anchorId="205314A5" id="Graphic 7" o:spid="_x0000_s1026" style="position:absolute;margin-left:53.85pt;margin-top:10pt;width:487.6pt;height:.1pt;z-index:-251658752;visibility:visible;mso-wrap-style:square;mso-wrap-distance-left:0;mso-wrap-distance-top:0;mso-wrap-distance-right:0;mso-wrap-distance-bottom:0;mso-position-horizontal:absolute;mso-position-horizontal-relative:page;mso-position-vertical:absolute;mso-position-vertical-relative:text;v-text-anchor:top" coordsize="6192520,1270" o:gfxdata="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" path="m,l6191999,e" filled="f" strokeweight=".14039mm">
+              <v:shape w14:anchorId="03DE9868" id="Graphic 7" o:spid="_x0000_s1026" style="position:absolute;margin-left:53.85pt;margin-top:10pt;width:487.6pt;height:.1pt;z-index:-251658752;visibility:visible;mso-wrap-style:square;mso-wrap-distance-left:0;mso-wrap-distance-top:0;mso-wrap-distance-right:0;mso-wrap-distance-bottom:0;mso-position-horizontal:absolute;mso-position-horizontal-relative:page;mso-position-vertical:absolute;mso-position-vertical-relative:text;v-text-anchor:top" coordsize="6192520,1270" o:gfxdata="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" path="m,l6191999,e" filled="f" strokeweight=".14039mm">
                 <v:path arrowok="t"/>
                 <w10:wrap type="topAndBottom" anchorx="page"/>
               </v:shape>
@@ -1388,7 +1388,7 @@
           </mc:Choice>
           <mc:Fallback>
             <w:pict>
-              <v:shape w14:anchorId="637CA68D" id="Graphic 8" o:spid="_x0000_s1026" style="position:absolute;margin-left:53.85pt;margin-top:9.95pt;width:487.6pt;height:.1pt;z-index:-251657728;visibility:visible;mso-wrap-style:square;mso-wrap-distance-left:0;mso-wrap-distance-top:0;mso-wrap-distance-right:0;mso-wrap-distance-bottom:0;mso-position-horizontal:absolute;mso-position-horizontal-relative:page;mso-position-vertical:absolute;mso-position-vertical-relative:text;v-text-anchor:top" coordsize="6192520,1270" o:gfxdata="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" path="m,l6191999,e" filled="f" strokeweight=".14039mm">
+              <v:shape w14:anchorId="2ECED1D0" id="Graphic 8" o:spid="_x0000_s1026" style="position:absolute;margin-left:53.85pt;margin-top:9.95pt;width:487.6pt;height:.1pt;z-index:-251657728;visibility:visible;mso-wrap-style:square;mso-wrap-distance-left:0;mso-wrap-distance-top:0;mso-wrap-distance-right:0;mso-wrap-distance-bottom:0;mso-position-horizontal:absolute;mso-position-horizontal-relative:page;mso-position-vertical:absolute;mso-position-vertical-relative:text;v-text-anchor:top" coordsize="6192520,1270" o:gfxdata="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" path="m,l6191999,e" filled="f" strokeweight=".14039mm">
                 <v:path arrowok="t"/>
                 <w10:wrap type="topAndBottom" anchorx="page"/>
               </v:shape>
@@ -1469,6 +1469,20 @@
           <w:spacing w:val="-2"/>
         </w:rPr>
         <w:t>tica</w:t>
+      </w:r>
+      <w:r>
+        <w:rPr>
+          <w:rFonts w:ascii="TeXGyreTermes" w:hAnsi="TeXGyreTermes"/>
+          <w:spacing w:val="-2"/>
+        </w:rPr>
+        <w:t xml:space="preserve"> e graduando em Ci</w:t>
+      </w:r>
+      <w:r>
+        <w:rPr>
+          <w:rFonts w:ascii="TeXGyreTermes" w:hAnsi="TeXGyreTermes"/>
+          <w:spacing w:val="-2"/>
+        </w:rPr>
+        <w:t>ência da Computação,</w:t>
       </w:r>
       <w:r>
         <w:rPr>
@@ -2298,7 +2312,7 @@
           </mc:Choice>
           <mc:Fallback>
             <w:pict>
-              <v:shape w14:anchorId="7F9C3205" id="Graphic 9" o:spid="_x0000_s1026" style="position:absolute;margin-left:53.85pt;margin-top:9.95pt;width:487.6pt;height:.1pt;z-index:-251656704;visibility:visible;mso-wrap-style:square;mso-wrap-distance-left:0;mso-wrap-distance-top:0;mso-wrap-distance-right:0;mso-wrap-distance-bottom:0;mso-position-horizontal:absolute;mso-position-horizontal-relative:page;mso-position-vertical:absolute;mso-position-vertical-relative:text;v-text-anchor:top" coordsize="6192520,1270" o:gfxdata="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" path="m,l6191999,e" filled="f" strokeweight=".14039mm">
+              <v:shape w14:anchorId="2327809D" id="Graphic 9" o:spid="_x0000_s1026" style="position:absolute;margin-left:53.85pt;margin-top:9.95pt;width:487.6pt;height:.1pt;z-index:-251656704;visibility:visible;mso-wrap-style:square;mso-wrap-distance-left:0;mso-wrap-distance-top:0;mso-wrap-distance-right:0;mso-wrap-distance-bottom:0;mso-position-horizontal:absolute;mso-position-horizontal-relative:page;mso-position-vertical:absolute;mso-position-vertical-relative:text;v-text-anchor:top" coordsize="6192520,1270" o:gfxdata="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" path="m,l6191999,e" filled="f" strokeweight=".14039mm">
                 <v:path arrowok="t"/>
                 <w10:wrap type="topAndBottom" anchorx="page"/>
               </v:shape>
@@ -2633,8 +2647,8 @@
         <w:tabs>
           <w:tab w:val="left" w:pos="269"/>
         </w:tabs>
-        <w:spacing w:before="0"/>
-        <w:ind w:left="269" w:hanging="184"/>
+        <w:spacing w:before="60"/>
+        <w:ind w:left="266" w:hanging="181"/>
         <w:rPr>
           <w:rFonts w:ascii="TeXGyreTermes" w:hAnsi="TeXGyreTermes"/>
         </w:rPr>
@@ -2846,7 +2860,8 @@
         <w:tabs>
           <w:tab w:val="left" w:pos="269"/>
         </w:tabs>
-        <w:ind w:left="269" w:hanging="184"/>
+        <w:spacing w:before="60"/>
+        <w:ind w:left="266" w:hanging="181"/>
         <w:rPr>
           <w:rFonts w:ascii="TeXGyreTermes" w:hAnsi="TeXGyreTermes"/>
         </w:rPr>
@@ -3023,8 +3038,8 @@
         <w:tabs>
           <w:tab w:val="left" w:pos="269"/>
         </w:tabs>
-        <w:spacing w:before="153"/>
-        <w:ind w:left="269" w:hanging="184"/>
+        <w:spacing w:before="60"/>
+        <w:ind w:left="266" w:hanging="181"/>
         <w:rPr>
           <w:rFonts w:ascii="TeXGyreTermes" w:hAnsi="TeXGyreTermes"/>
         </w:rPr>
@@ -3190,7 +3205,8 @@
         <w:tabs>
           <w:tab w:val="left" w:pos="269"/>
         </w:tabs>
-        <w:ind w:left="269" w:hanging="184"/>
+        <w:spacing w:before="60"/>
+        <w:ind w:left="266" w:hanging="181"/>
         <w:rPr>
           <w:rFonts w:ascii="TeXGyreTermes" w:hAnsi="TeXGyreTermes"/>
         </w:rPr>
@@ -3409,8 +3425,8 @@
         <w:tabs>
           <w:tab w:val="left" w:pos="269"/>
         </w:tabs>
-        <w:spacing w:before="153"/>
-        <w:ind w:left="269" w:hanging="184"/>
+        <w:spacing w:before="60"/>
+        <w:ind w:left="266" w:hanging="181"/>
         <w:rPr>
           <w:rFonts w:ascii="TeXGyreTermes" w:hAnsi="TeXGyreTermes"/>
         </w:rPr>
@@ -3768,7 +3784,23 @@
           <w:i/>
           <w:spacing w:val="-8"/>
         </w:rPr>
-        <w:t>marc¸o/2024</w:t>
+        <w:t>mar</w:t>
+      </w:r>
+      <w:r>
+        <w:rPr>
+          <w:rFonts w:ascii="TeXGyreTermes" w:hAnsi="TeXGyreTermes"/>
+          <w:i/>
+          <w:spacing w:val="-8"/>
+        </w:rPr>
+        <w:t>ç</w:t>
+      </w:r>
+      <w:r>
+        <w:rPr>
+          <w:rFonts w:ascii="TeXGyreTermes" w:hAnsi="TeXGyreTermes"/>
+          <w:i/>
+          <w:spacing w:val="-8"/>
+        </w:rPr>
+        <w:t>o/2024</w:t>
       </w:r>
       <w:r>
         <w:rPr>
@@ -3878,8 +3910,8 @@
         <w:tabs>
           <w:tab w:val="left" w:pos="269"/>
         </w:tabs>
-        <w:spacing w:before="0"/>
-        <w:ind w:left="269" w:hanging="184"/>
+        <w:spacing w:before="60"/>
+        <w:ind w:left="266" w:hanging="181"/>
         <w:rPr>
           <w:rFonts w:ascii="TeXGyreTermes" w:hAnsi="TeXGyreTermes"/>
         </w:rPr>
@@ -4107,7 +4139,8 @@
         <w:tabs>
           <w:tab w:val="left" w:pos="269"/>
         </w:tabs>
-        <w:ind w:left="269" w:hanging="184"/>
+        <w:spacing w:before="60"/>
+        <w:ind w:left="266" w:hanging="181"/>
         <w:rPr>
           <w:rFonts w:ascii="TeXGyreTermes" w:hAnsi="TeXGyreTermes"/>
         </w:rPr>
@@ -4250,8 +4283,8 @@
         <w:tabs>
           <w:tab w:val="left" w:pos="269"/>
         </w:tabs>
-        <w:spacing w:before="0"/>
-        <w:ind w:left="269" w:hanging="184"/>
+        <w:spacing w:before="60"/>
+        <w:ind w:left="266" w:hanging="181"/>
         <w:rPr>
           <w:rFonts w:ascii="TeXGyreTermes" w:hAnsi="TeXGyreTermes"/>
         </w:rPr>
@@ -4505,8 +4538,8 @@
         <w:tabs>
           <w:tab w:val="left" w:pos="269"/>
         </w:tabs>
-        <w:spacing w:before="153"/>
-        <w:ind w:left="269" w:hanging="184"/>
+        <w:spacing w:before="60"/>
+        <w:ind w:left="266" w:hanging="181"/>
         <w:rPr>
           <w:rFonts w:ascii="TeXGyreTermes" w:hAnsi="TeXGyreTermes"/>
         </w:rPr>
@@ -4681,7 +4714,7 @@
     <w:p>
       <w:pPr>
         <w:pStyle w:val="Corpodetexto"/>
-        <w:spacing w:before="2"/>
+        <w:spacing w:before="60"/>
         <w:ind w:left="0" w:firstLine="0"/>
         <w:rPr>
           <w:rFonts w:ascii="TeXGyreTermes" w:hAnsi="TeXGyreTermes"/>
@@ -4761,7 +4794,7 @@
           </mc:Choice>
           <mc:Fallback>
             <w:pict>
-              <v:shape w14:anchorId="08B2E71F" id="Graphic 10" o:spid="_x0000_s1026" style="position:absolute;margin-left:53.85pt;margin-top:9.95pt;width:487.6pt;height:.1pt;z-index:-251655680;visibility:visible;mso-wrap-style:square;mso-wrap-distance-left:0;mso-wrap-distance-top:0;mso-wrap-distance-right:0;mso-wrap-distance-bottom:0;mso-position-horizontal:absolute;mso-position-horizontal-relative:page;mso-position-vertical:absolute;mso-position-vertical-relative:text;v-text-anchor:top" coordsize="6192520,1270" o:gfxdata="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" path="m,l6191999,e" filled="f" strokeweight=".14039mm">
+              <v:shape w14:anchorId="378D8702" id="Graphic 10" o:spid="_x0000_s1026" style="position:absolute;margin-left:53.85pt;margin-top:9.95pt;width:487.6pt;height:.1pt;z-index:-251655680;visibility:visible;mso-wrap-style:square;mso-wrap-distance-left:0;mso-wrap-distance-top:0;mso-wrap-distance-right:0;mso-wrap-distance-bottom:0;mso-position-horizontal:absolute;mso-position-horizontal-relative:page;mso-position-vertical:absolute;mso-position-vertical-relative:text;v-text-anchor:top" coordsize="6192520,1270" o:gfxdata="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" path="m,l6191999,e" filled="f" strokeweight=".14039mm">
                 <v:path arrowok="t"/>
                 <w10:wrap type="topAndBottom" anchorx="page"/>
               </v:shape>
@@ -4780,7 +4813,7 @@
         <w:tabs>
           <w:tab w:val="left" w:pos="269"/>
         </w:tabs>
-        <w:spacing w:before="0"/>
+        <w:spacing w:before="60"/>
         <w:ind w:left="269" w:hanging="184"/>
         <w:rPr>
           <w:rFonts w:ascii="TeXGyreTermes" w:hAnsi="TeXGyreTermes"/>
@@ -4908,8 +4941,7 @@
         <w:tabs>
           <w:tab w:val="left" w:pos="269"/>
         </w:tabs>
-        <w:spacing w:before="153"/>
-        <w:ind w:left="269" w:hanging="184"/>
+        <w:spacing w:before="60"/>
         <w:rPr>
           <w:rFonts w:ascii="TeXGyreTermes" w:hAnsi="TeXGyreTermes"/>
         </w:rPr>
@@ -5036,6 +5068,7 @@
         <w:tabs>
           <w:tab w:val="left" w:pos="269"/>
         </w:tabs>
+        <w:spacing w:before="60"/>
         <w:ind w:left="269" w:hanging="184"/>
         <w:rPr>
           <w:rFonts w:ascii="TeXGyreTermes" w:hAnsi="TeXGyreTermes"/>
@@ -5137,8 +5170,8 @@
         <w:tabs>
           <w:tab w:val="left" w:pos="269"/>
         </w:tabs>
-        <w:spacing w:before="153"/>
-        <w:ind w:left="269" w:hanging="184"/>
+        <w:spacing w:before="60"/>
+        <w:ind w:left="266" w:hanging="181"/>
         <w:rPr>
           <w:rFonts w:ascii="TeXGyreTermes" w:hAnsi="TeXGyreTermes"/>
         </w:rPr>
@@ -5329,7 +5362,8 @@
         <w:tabs>
           <w:tab w:val="left" w:pos="269"/>
         </w:tabs>
-        <w:ind w:left="269" w:hanging="184"/>
+        <w:spacing w:before="60"/>
+        <w:ind w:left="266" w:hanging="181"/>
         <w:rPr>
           <w:rFonts w:ascii="TeXGyreTermes" w:hAnsi="TeXGyreTermes"/>
         </w:rPr>
@@ -5673,7 +5707,7 @@
           </mc:Choice>
           <mc:Fallback>
             <w:pict>
-              <v:shape w14:anchorId="7CA63F07" id="Graphic 11" o:spid="_x0000_s1026" style="position:absolute;margin-left:53.85pt;margin-top:9.95pt;width:487.6pt;height:.1pt;z-index:251655680;visibility:visible;mso-wrap-style:square;mso-wrap-distance-left:0;mso-wrap-distance-top:0;mso-wrap-distance-right:0;mso-wrap-distance-bottom:0;mso-position-horizontal:absolute;mso-position-horizontal-relative:page;mso-position-vertical:absolute;mso-position-vertical-relative:text;v-text-anchor:top" coordsize="6192520,1270" o:gfxdata="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" path="m,l6191999,e" filled="f" strokeweight=".14039mm">
+              <v:shape w14:anchorId="1AC388CD" id="Graphic 11" o:spid="_x0000_s1026" style="position:absolute;margin-left:53.85pt;margin-top:9.95pt;width:487.6pt;height:.1pt;z-index:251655680;visibility:visible;mso-wrap-style:square;mso-wrap-distance-left:0;mso-wrap-distance-top:0;mso-wrap-distance-right:0;mso-wrap-distance-bottom:0;mso-position-horizontal:absolute;mso-position-horizontal-relative:page;mso-position-vertical:absolute;mso-position-vertical-relative:text;v-text-anchor:top" coordsize="6192520,1270" o:gfxdata="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" path="m,l6191999,e" filled="f" strokeweight=".14039mm">
                 <v:path arrowok="t"/>
                 <w10:wrap anchorx="page"/>
               </v:shape>
@@ -5922,10 +5956,11 @@
     <w:p>
       <w:pPr>
         <w:pStyle w:val="Corpodetexto"/>
-        <w:spacing w:before="18"/>
+        <w:spacing w:before="0"/>
         <w:ind w:left="85" w:firstLine="0"/>
         <w:rPr>
           <w:rFonts w:ascii="TeXGyreTermes" w:hAnsi="TeXGyreTermes"/>
+          <w:spacing w:val="-4"/>
         </w:rPr>
       </w:pPr>
       <w:r>
@@ -6060,12 +6095,113 @@
           <w:spacing w:val="-4"/>
         </w:rPr>
         <w:t>dio</w:t>
+      </w:r>
+    </w:p>
+    <w:p>
+      <w:pPr>
+        <w:pStyle w:val="Corpodetexto"/>
+        <w:spacing w:before="76"/>
+        <w:ind w:left="85" w:firstLine="0"/>
+        <w:rPr>
+          <w:rFonts w:ascii="TeXGyreTermes" w:hAnsi="TeXGyreTermes"/>
+          <w:i/>
+          <w:iCs/>
+        </w:rPr>
+      </w:pPr>
+      <w:r>
+        <w:rPr>
+          <w:rFonts w:ascii="TeXGyreTermes" w:hAnsi="TeXGyreTermes"/>
+          <w:b/>
+          <w:bCs/>
+        </w:rPr>
+        <w:t xml:space="preserve">Universidade Federal Rural do Rio de Janeiro (UFRRJ) </w:t>
+      </w:r>
+      <w:r>
+        <w:rPr>
+          <w:rFonts w:ascii="TeXGyreTermes" w:hAnsi="TeXGyreTermes"/>
+          <w:b/>
+          <w:bCs/>
+        </w:rPr>
+        <w:tab/>
+      </w:r>
+      <w:r>
+        <w:rPr>
+          <w:rFonts w:ascii="TeXGyreTermes" w:hAnsi="TeXGyreTermes"/>
+          <w:i/>
+          <w:iCs/>
+        </w:rPr>
+        <w:t>mar</w:t>
+      </w:r>
+      <w:r>
+        <w:rPr>
+          <w:rFonts w:ascii="TeXGyreTermes" w:hAnsi="TeXGyreTermes"/>
+          <w:i/>
+          <w:iCs/>
+        </w:rPr>
+        <w:t>ç</w:t>
+      </w:r>
+      <w:r>
+        <w:rPr>
+          <w:rFonts w:ascii="TeXGyreTermes" w:hAnsi="TeXGyreTermes"/>
+          <w:i/>
+          <w:iCs/>
+        </w:rPr>
+        <w:t>o/2023 – conclus</w:t>
+      </w:r>
+      <w:r>
+        <w:rPr>
+          <w:rFonts w:ascii="TeXGyreTermes" w:hAnsi="TeXGyreTermes"/>
+          <w:i/>
+          <w:iCs/>
+        </w:rPr>
+        <w:t>ã</w:t>
+      </w:r>
+      <w:r>
+        <w:rPr>
+          <w:rFonts w:ascii="TeXGyreTermes" w:hAnsi="TeXGyreTermes"/>
+          <w:i/>
+          <w:iCs/>
+        </w:rPr>
+        <w:t>o prevista mar</w:t>
+      </w:r>
+      <w:r>
+        <w:rPr>
+          <w:rFonts w:ascii="TeXGyreTermes" w:hAnsi="TeXGyreTermes"/>
+          <w:i/>
+          <w:iCs/>
+        </w:rPr>
+        <w:t>ç</w:t>
+      </w:r>
+      <w:r>
+        <w:rPr>
+          <w:rFonts w:ascii="TeXGyreTermes" w:hAnsi="TeXGyreTermes"/>
+          <w:i/>
+          <w:iCs/>
+        </w:rPr>
+        <w:t>o/2030</w:t>
+      </w:r>
+    </w:p>
+    <w:p>
+      <w:pPr>
+        <w:pStyle w:val="Corpodetexto"/>
+        <w:spacing w:before="0"/>
+        <w:ind w:left="85" w:firstLine="0"/>
+        <w:jc w:val="both"/>
+        <w:rPr>
+          <w:rFonts w:ascii="TeXGyreTermes" w:hAnsi="TeXGyreTermes"/>
+        </w:rPr>
+      </w:pPr>
+      <w:r>
+        <w:rPr>
+          <w:rFonts w:ascii="TeXGyreTermes" w:hAnsi="TeXGyreTermes"/>
+        </w:rPr>
+        <w:t>Graduação em Ciência da Computação</w:t>
       </w:r>
     </w:p>
     <w:sectPr>
       <w:type w:val="continuous"/>
       <w:pgSz w:w="11910" w:h="16840"/>
-      <w:pgMar w:top="1134" w:right="850" w:bottom="280" w:left="992" w:header="720" w:footer="720" w:gutter="0"/>
+      <w:pgMar w:top="851" w:right="850" w:bottom="280" w:left="992" w:header="720" w:footer="720" w:gutter="0"/>
       <w:cols w:space="720"/>
     </w:sectPr>
   </w:body>

</xml_diff>